<commit_message>
docs: update final report docx
</commit_message>
<xml_diff>
--- a/Bao_cao_toan_van_Rehab_AI_Monitor_DaSuaTrichDan_bo_sung_them_frames_final.docx
+++ b/Bao_cao_toan_van_Rehab_AI_Monitor_DaSuaTrichDan_bo_sung_them_frames_final.docx
@@ -4,8 +4,14 @@
   <w:body>
     <w:p>
       <w:pPr>
-        <w:spacing w:after="120"/>
+        <w:spacing w:after="40"/>
         <w:jc w:val="center"/>
+        <w:rPr>
+          <w:b/>
+          <w:bCs/>
+          <w:sz w:val="28"/>
+          <w:szCs w:val="28"/>
+        </w:rPr>
       </w:pPr>
       <w:r>
         <w:rPr>
@@ -14,13 +20,59 @@
           <w:sz w:val="28"/>
           <w:szCs w:val="28"/>
         </w:rPr>
-        <w:t>ỨNG DỤNG TRÍ TUỆ NHÂN TẠO VÀ THỊ GIÁC MÁY TÍNH TRONG GIÁM SÁT TẬP LUYỆN PHỤC HỒI CHỨC NĂNG KHỚP VAI TỪ XA</w:t>
+        <w:t>ỨNG DỤNG TRÍ TUỆ NHÂN TẠO (AI) VÀ THỊ GIÁC MÁY TÍNH</w:t>
       </w:r>
     </w:p>
     <w:p>
       <w:pPr>
         <w:spacing w:after="40"/>
         <w:jc w:val="center"/>
+        <w:rPr>
+          <w:b/>
+          <w:bCs/>
+          <w:sz w:val="28"/>
+          <w:szCs w:val="28"/>
+        </w:rPr>
+      </w:pPr>
+      <w:r>
+        <w:rPr>
+          <w:b/>
+          <w:bCs/>
+          <w:sz w:val="28"/>
+          <w:szCs w:val="28"/>
+        </w:rPr>
+        <w:t>TRONG GIÁM SÁT TẬP LUYỆN PHỤC HỒI CHỨC NĂNG TỪ XA TẠI</w:t>
+      </w:r>
+    </w:p>
+    <w:p>
+      <w:pPr>
+        <w:spacing w:after="40"/>
+        <w:jc w:val="center"/>
+        <w:rPr>
+          <w:b/>
+          <w:bCs/>
+          <w:sz w:val="28"/>
+          <w:szCs w:val="28"/>
+        </w:rPr>
+      </w:pPr>
+      <w:r>
+        <w:rPr>
+          <w:b/>
+          <w:bCs/>
+          <w:sz w:val="28"/>
+          <w:szCs w:val="28"/>
+        </w:rPr>
+        <w:t>VIỆT NAM</w:t>
+      </w:r>
+    </w:p>
+    <w:p>
+      <w:pPr>
+        <w:spacing w:before="100" w:after="120"/>
+        <w:jc w:val="right"/>
+        <w:rPr>
+          <w:sz w:val="24"/>
+          <w:szCs w:val="24"/>
+        </w:rPr>
       </w:pPr>
       <w:r>
         <w:rPr>
@@ -29,20 +81,57 @@
           <w:sz w:val="24"/>
           <w:szCs w:val="24"/>
         </w:rPr>
-        <w:t xml:space="preserve">Báo cáo viên: </w:t>
+        <w:t>Người hướng dẫn:</w:t>
       </w:r>
       <w:r>
         <w:rPr>
           <w:sz w:val="24"/>
           <w:szCs w:val="24"/>
         </w:rPr>
-        <w:t>Đinh Lê Quỳnh Phương (Lớp CNCQ KHDL1-1A)</w:t>
+        <w:t xml:space="preserve"> </w:t>
+      </w:r>
+      <w:r>
+        <w:rPr>
+          <w:b/>
+          <w:bCs/>
+          <w:sz w:val="24"/>
+          <w:szCs w:val="24"/>
+        </w:rPr>
+        <w:t>TS. Trần Hồng Việt</w:t>
+      </w:r>
+      <w:r>
+        <w:rPr>
+          <w:sz w:val="24"/>
+          <w:szCs w:val="24"/>
+        </w:rPr>
+        <w:t xml:space="preserve"> (Viện Trí tuệ Nhân tạo, ĐH Công nghệ,</w:t>
       </w:r>
     </w:p>
     <w:p>
       <w:pPr>
-        <w:spacing w:after="40"/>
-        <w:jc w:val="center"/>
+        <w:spacing w:before="100" w:after="120"/>
+        <w:jc w:val="right"/>
+        <w:rPr>
+          <w:sz w:val="24"/>
+          <w:szCs w:val="24"/>
+        </w:rPr>
+      </w:pPr>
+      <w:r>
+        <w:rPr>
+          <w:sz w:val="24"/>
+          <w:szCs w:val="24"/>
+        </w:rPr>
+        <w:t>ĐHQG HN);</w:t>
+      </w:r>
+    </w:p>
+    <w:p>
+      <w:pPr>
+        <w:spacing w:before="100" w:after="120"/>
+        <w:jc w:val="right"/>
+        <w:rPr>
+          <w:sz w:val="24"/>
+          <w:szCs w:val="24"/>
+        </w:rPr>
       </w:pPr>
       <w:r>
         <w:rPr>
@@ -51,20 +140,24 @@
           <w:sz w:val="24"/>
           <w:szCs w:val="24"/>
         </w:rPr>
-        <w:t xml:space="preserve">Nhóm nghiên cứu: </w:t>
+        <w:t>CN. Nguyễn Thị Thùy Chi</w:t>
       </w:r>
       <w:r>
         <w:rPr>
           <w:sz w:val="24"/>
           <w:szCs w:val="24"/>
         </w:rPr>
-        <w:t>Kim Mạnh Hưng, Nguyễn Hải An, Phan Vân Anh, Nguyễn Thị Thanh Nga (CNCQ KHDL1-1A); Nguyễn Thị Thơm (CNCQ KTPHCN3-1A); Nguyễn Thị Thu Hương (CNCQ YTCC22-1A) – Trường Đại học Y tế Công cộng</w:t>
+        <w:t xml:space="preserve"> (Trường ĐHYTCC)</w:t>
       </w:r>
     </w:p>
     <w:p>
       <w:pPr>
-        <w:spacing w:after="40"/>
-        <w:jc w:val="center"/>
+        <w:spacing w:before="100" w:after="120"/>
+        <w:jc w:val="right"/>
+        <w:rPr>
+          <w:sz w:val="24"/>
+          <w:szCs w:val="24"/>
+        </w:rPr>
       </w:pPr>
       <w:r>
         <w:rPr>
@@ -73,20 +166,118 @@
           <w:sz w:val="24"/>
           <w:szCs w:val="24"/>
         </w:rPr>
-        <w:t xml:space="preserve">Người hướng dẫn: </w:t>
+        <w:t>Người báo cáo: Đinh Lê Quỳnh Phương</w:t>
       </w:r>
       <w:r>
         <w:rPr>
           <w:sz w:val="24"/>
           <w:szCs w:val="24"/>
         </w:rPr>
-        <w:t>TS. Trần Hồng Việt (Viện Trí tuệ Nhân tạo, Trường Đại học Công nghệ, ĐHQG Hà Nội); CN. Nguyễn Thị Thùy Chi (Trường Đại học Y tế Công cộng)</w:t>
+        <w:t xml:space="preserve"> (CNCQKHDL1-1A)</w:t>
+      </w:r>
+    </w:p>
+    <w:p>
+      <w:pPr>
+        <w:spacing w:before="100" w:after="120"/>
+        <w:jc w:val="right"/>
+        <w:rPr>
+          <w:sz w:val="24"/>
+          <w:szCs w:val="24"/>
+        </w:rPr>
+      </w:pPr>
+      <w:r>
+        <w:rPr>
+          <w:b/>
+          <w:bCs/>
+          <w:sz w:val="24"/>
+          <w:szCs w:val="24"/>
+        </w:rPr>
+        <w:t>Nhóm nghiên cứu: Kim Mạnh Hưng, Nguyễn Thị Thanh Nga</w:t>
+      </w:r>
+      <w:r>
+        <w:rPr>
+          <w:sz w:val="24"/>
+          <w:szCs w:val="24"/>
+        </w:rPr>
+        <w:t xml:space="preserve"> (CNCQ KHDL1-</w:t>
+      </w:r>
+    </w:p>
+    <w:p>
+      <w:pPr>
+        <w:spacing w:before="100" w:after="120"/>
+        <w:jc w:val="right"/>
+        <w:rPr>
+          <w:sz w:val="24"/>
+          <w:szCs w:val="24"/>
+        </w:rPr>
+      </w:pPr>
+      <w:r>
+        <w:rPr>
+          <w:sz w:val="24"/>
+          <w:szCs w:val="24"/>
+        </w:rPr>
+        <w:t xml:space="preserve">1A); </w:t>
+      </w:r>
+      <w:r>
+        <w:rPr>
+          <w:b/>
+          <w:bCs/>
+          <w:sz w:val="24"/>
+          <w:szCs w:val="24"/>
+        </w:rPr>
+        <w:t>Nguyễn Thị Thơm</w:t>
+      </w:r>
+      <w:r>
+        <w:rPr>
+          <w:sz w:val="24"/>
+          <w:szCs w:val="24"/>
+        </w:rPr>
+        <w:t xml:space="preserve"> (CNCQ KTPHCN3-1A); </w:t>
+      </w:r>
+      <w:r>
+        <w:rPr>
+          <w:b/>
+          <w:bCs/>
+          <w:sz w:val="24"/>
+          <w:szCs w:val="24"/>
+        </w:rPr>
+        <w:t>Nguyễn Thị Thu Hương</w:t>
+      </w:r>
+      <w:r>
+        <w:rPr>
+          <w:sz w:val="24"/>
+          <w:szCs w:val="24"/>
+        </w:rPr>
+        <w:t xml:space="preserve"> (CNCQ</w:t>
+      </w:r>
+    </w:p>
+    <w:p>
+      <w:pPr>
+        <w:spacing w:before="100" w:after="120"/>
+        <w:jc w:val="right"/>
+        <w:rPr>
+          <w:sz w:val="24"/>
+          <w:szCs w:val="24"/>
+        </w:rPr>
+      </w:pPr>
+      <w:r>
+        <w:rPr>
+          <w:sz w:val="24"/>
+          <w:szCs w:val="24"/>
+        </w:rPr>
+        <w:t>YTCC22-1A) – Trường Đại học Y tế Công cộng</w:t>
       </w:r>
     </w:p>
     <w:p>
       <w:pPr>
         <w:spacing w:before="100" w:after="120"/>
         <w:jc w:val="both"/>
+        <w:rPr>
+          <w:i/>
+          <w:iCs/>
+          <w:sz w:val="24"/>
+          <w:szCs w:val="24"/>
+        </w:rPr>
       </w:pPr>
       <w:r>
         <w:rPr>
@@ -106,7 +297,22 @@
           <w:sz w:val="24"/>
           <w:szCs w:val="24"/>
         </w:rPr>
-        <w:t>Phục hồi chức năng từ xa; trí tuệ nhân tạo; thị giác máy tính; ước lượng tư thế; phân loại động tác; MediaPipe Pose; viêm quanh khớp vai.</w:t>
+        <w:t>Từ khóa: Phục hồi chức năng từ xa; trí tuệ nhân tạo; thị giác máy tính; ước lượng tư</w:t>
+      </w:r>
+    </w:p>
+    <w:p>
+      <w:pPr>
+        <w:spacing w:before="100" w:after="120"/>
+        <w:jc w:val="both"/>
+      </w:pPr>
+      <w:r>
+        <w:rPr>
+          <w:i/>
+          <w:iCs/>
+          <w:sz w:val="24"/>
+          <w:szCs w:val="24"/>
+        </w:rPr>
+        <w:t>thế; phân loại động tác; MediaPipe Pose.</w:t>
       </w:r>
     </w:p>
     <w:p>
@@ -157,14 +363,8 @@
         <w:rPr>
           <w:color w:val="000000"/>
         </w:rPr>
-        <w:t xml:space="preserve">Trong lĩnh vực PHCN, AI và CV được ứng dụng theo ba hướng chính: giám sát và phản hồi bài tập theo thời gian thực, đánh giá tiến triển hồi phục, và hỗ trợ bác sĩ/kỹ thuật viên xây dựng phác đồ cá nhân hóa (6,7,8). Các hệ thống marker-less hiện đại dựa trên MediaPipe hoặc OpenPose được báo cáo đạt sai số góc khớp trung bình chỉ khoảng 3°–7° so với hệ thống chuẩn dùng cảm biến quang học, và nhiều nghiên cứu kiểm chứng độ giá trị đồng quy ghi nhận hệ số tương quan nội nhóm (ICC) cao tới 0,93 đối với tầm </w:t>
-      </w:r>
-      <w:r>
-        <w:rPr>
-          <w:color w:val="000000"/>
-        </w:rPr>
         <w:lastRenderedPageBreak/>
-        <w:t>vận động khớp (9,10). Tuy nhiên, phần lớn các kết quả này được thực hiện trên người tình nguyện khỏe mạnh trong điều kiện phòng thí nghiệm.</w:t>
+        <w:t>Trong lĩnh vực PHCN, AI và CV được ứng dụng theo ba hướng chính: giám sát và phản hồi bài tập theo thời gian thực, đánh giá tiến triển hồi phục, và hỗ trợ bác sĩ/kỹ thuật viên xây dựng phác đồ cá nhân hóa (6,7,8). Các hệ thống marker-less hiện đại dựa trên MediaPipe hoặc OpenPose được báo cáo đạt sai số góc khớp trung bình chỉ khoảng 3°–7° so với hệ thống chuẩn dùng cảm biến quang học, và nhiều nghiên cứu kiểm chứng độ giá trị đồng quy ghi nhận hệ số tương quan nội nhóm (ICC) cao tới 0,93 đối với tầm vận động khớp (9,10). Tuy nhiên, phần lớn các kết quả này được thực hiện trên người tình nguyện khỏe mạnh trong điều kiện phòng thí nghiệm.</w:t>
       </w:r>
     </w:p>
     <w:p>
@@ -220,7 +420,14 @@
         <w:rPr>
           <w:color w:val="000000"/>
         </w:rPr>
-        <w:t>Đối tượng gồm hai nhóm tại Khoa Phục hồi chức năng – Bệnh viện Đa khoa Phạm Ngọc Thạch. Nhóm người bệnh là những bệnh nhân được chẩn đoán viêm quanh khớp vai (ICD-10: M75; bệnh lý gân cơ chóp xoay hoặc viêm dính bao khớp/đông cứng khớp vai), điều trị ngoại trú và được chỉ định gói bài tập chuẩn hóa (con lắc Codman, bài tập với gậy, bài tập với dây kháng lực). Tiêu chuẩn lựa chọn: có chẩn đoán xác định, hợp tác tốt, nhận thức bình thường, đồng ý ghi hình trước camera và ký giấy đồng thuận. Tiêu chuẩn loại trừ: có chống chỉ định vận động, hoặc không thực hiện trọn vẹn quy trình ghi hình. Nhóm chuyên gia tham chiếu là bác sĩ hoặc kỹ thuật viên PHCN có ít nhất 01 năm kinh nghiệm cơ xương khớp; loại trừ người đang nghỉ dài hạn hoặc không có điều kiện ghi chép phiếu đánh giá định kỳ.</w:t>
+        <w:t xml:space="preserve">Đối tượng gồm hai nhóm tại Khoa Phục hồi chức năng – Bệnh viện Đa khoa Phạm Ngọc Thạch. Nhóm người bệnh là những bệnh nhân được chẩn đoán viêm quanh khớp vai (ICD-10: M75; bệnh lý gân cơ chóp xoay hoặc viêm dính bao khớp/đông cứng khớp vai), điều trị ngoại trú và được chỉ định gói bài tập chuẩn hóa (con lắc Codman, bài tập với gậy, bài tập với dây kháng lực). Tiêu chuẩn lựa chọn: có chẩn đoán xác định, hợp tác tốt, nhận thức bình thường, đồng ý ghi hình trước camera và ký giấy đồng thuận. Tiêu chuẩn loại trừ: có chống chỉ định vận động, hoặc không </w:t>
+      </w:r>
+      <w:r>
+        <w:rPr>
+          <w:color w:val="000000"/>
+        </w:rPr>
+        <w:lastRenderedPageBreak/>
+        <w:t>thực hiện trọn vẹn quy trình ghi hình. Nhóm chuyên gia tham chiếu là bác sĩ hoặc kỹ thuật viên PHCN có ít nhất 01 năm kinh nghiệm cơ xương khớp; loại trừ người đang nghỉ dài hạn hoặc không có điều kiện ghi chép phiếu đánh giá định kỳ.</w:t>
       </w:r>
     </w:p>
     <w:p>
@@ -256,7 +463,6 @@
           <w:bCs/>
           <w:color w:val="000000"/>
         </w:rPr>
-        <w:lastRenderedPageBreak/>
         <w:t xml:space="preserve">Thời gian và địa điểm. </w:t>
       </w:r>
       <w:r>
@@ -304,7 +510,11 @@
         <w:jc w:val="both"/>
       </w:pPr>
       <w:r>
-        <w:t>Chỉ số nghiên cứu. Biến đầu ra của mô hình gồm tọa độ 33 điểm khớp, góc vai/khuỷu do thuật toán tính, góc tham chiếu trong CSV (shoulder_ref/elbow_ref), nhãn trạng thái REF (PASS/NEAR/FAIL/UNKNOWN) và nhãn ML hiển thị trên overlay. Trong bộ full export hiện tại, ml_label ánh xạ trực tiếp với status (PASS=2, NEAR=1, FAIL=0, UNKNOWN=UNKNOWN), vì vậy các bảng cập nhật tập trung vào ACC, PASS+NEAR, UNKNOWN, MAE và RMSE thay vì diễn giải F1/Precision/Recall như một đánh giá độc lập.</w:t>
+        <w:t xml:space="preserve">Chỉ số nghiên cứu. Biến đầu ra của mô hình gồm tọa độ 33 điểm khớp, góc vai/khuỷu do thuật toán tính, góc tham chiếu trong CSV (shoulder_ref/elbow_ref), nhãn trạng thái REF (PASS/NEAR/FAIL/UNKNOWN) và nhãn ML hiển thị trên overlay. Trong bộ full export hiện tại, ml_label ánh xạ trực tiếp với status (PASS=2, NEAR=1, FAIL=0, UNKNOWN=UNKNOWN), vì vậy các bảng cập nhật tập trung vào ACC, </w:t>
+      </w:r>
+      <w:r>
+        <w:lastRenderedPageBreak/>
+        <w:t>PASS+NEAR, UNKNOWN, MAE và RMSE thay vì diễn giải F1/Precision/Recall như một đánh giá độc lập.</w:t>
       </w:r>
     </w:p>
     <w:p>
@@ -314,11 +524,7 @@
         <w:jc w:val="both"/>
       </w:pPr>
       <w:r>
-        <w:t xml:space="preserve">Phương pháp xử lý số liệu. Các chỉ số được tái tính trực tiếp từ 8 file frame_data_all.csv trong full export mới nhất. ACC được tính bằng PASS/(PASS+NEAR+FAIL), tức không tính các khung UNKNOWN vào mẫu số; đồng thời báo cáo thêm ACC tính cả UNKNOWN và tỷ lệ PASS+NEAR để người đọc thấy </w:t>
-      </w:r>
-      <w:r>
-        <w:lastRenderedPageBreak/>
-        <w:t>ảnh hưởng của lọc khung. MAE và RMSE được tính trên sai số tuyệt đối giữa góc AI (goc_vai/goc_khuyu) và góc tham chiếu (shoulder_ref/elbow_ref) cho cả vai và khuỷu.</w:t>
+        <w:t>Phương pháp xử lý số liệu. Các chỉ số được tái tính trực tiếp từ 8 file frame_data_all.csv trong full export mới nhất. ACC được tính bằng PASS/(PASS+NEAR+FAIL), tức không tính các khung UNKNOWN vào mẫu số; đồng thời báo cáo thêm ACC tính cả UNKNOWN và tỷ lệ PASS+NEAR để người đọc thấy ảnh hưởng của lọc khung. MAE và RMSE được tính trên sai số tuyệt đối giữa góc AI (goc_vai/goc_khuyu) và góc tham chiếu (shoulder_ref/elbow_ref) cho cả vai và khuỷu.</w:t>
       </w:r>
     </w:p>
     <w:p>
@@ -425,6 +631,7 @@
         <w:jc w:val="center"/>
       </w:pPr>
       <w:r>
+        <w:lastRenderedPageBreak/>
         <w:t>Hình 1. Minh họa khung hình overlay và cách tính góc vai/khuỷu; sơ đồ xử lý video hai lượt (2-Pass) nêu rõ: Codman mới chia GĐ1/GĐ2/GĐ3, còn bài tập với gậy tính trên tất cả khung hình của toàn video.</w:t>
       </w:r>
     </w:p>
@@ -437,7 +644,6 @@
         <w:rPr>
           <w:noProof/>
         </w:rPr>
-        <w:lastRenderedPageBreak/>
         <w:drawing>
           <wp:anchor distT="0" distB="0" distL="114300" distR="114300" simplePos="0" relativeHeight="251658240" behindDoc="1" locked="0" layoutInCell="1" allowOverlap="1" wp14:anchorId="18061A3C" wp14:editId="2CA70F2B">
             <wp:simplePos x="0" y="0"/>
@@ -604,6 +810,7 @@
         <w:rPr>
           <w:noProof/>
         </w:rPr>
+        <w:lastRenderedPageBreak/>
         <w:drawing>
           <wp:anchor distT="0" distB="0" distL="114300" distR="114300" simplePos="0" relativeHeight="251659264" behindDoc="1" locked="0" layoutInCell="1" allowOverlap="1" wp14:anchorId="6DEA89B8" wp14:editId="75FC4663">
             <wp:simplePos x="0" y="0"/>
@@ -718,7 +925,6 @@
         <w:rPr>
           <w:noProof/>
         </w:rPr>
-        <w:lastRenderedPageBreak/>
         <w:drawing>
           <wp:anchor distT="0" distB="0" distL="114300" distR="114300" simplePos="0" relativeHeight="251660288" behindDoc="1" locked="0" layoutInCell="1" allowOverlap="1" wp14:anchorId="29E2D65E" wp14:editId="4262768A">
             <wp:simplePos x="0" y="0"/>
@@ -878,6 +1084,7 @@
           <w:sz w:val="24"/>
           <w:szCs w:val="24"/>
         </w:rPr>
+        <w:lastRenderedPageBreak/>
         <w:t>Bảng 1. Đặc điểm chung của mẫu nghiên cứu (n = 8)</w:t>
       </w:r>
     </w:p>
@@ -3690,6 +3897,7 @@
                 <w:sz w:val="22"/>
                 <w:szCs w:val="22"/>
               </w:rPr>
+              <w:lastRenderedPageBreak/>
               <w:t>BN03</w:t>
             </w:r>
           </w:p>
@@ -3944,7 +4152,6 @@
           <w:sz w:val="24"/>
           <w:szCs w:val="24"/>
         </w:rPr>
-        <w:lastRenderedPageBreak/>
         <w:t>Bảng 3. Cấu trúc bộ dữ liệu khung hình overlay theo người bệnh và bài tập</w:t>
       </w:r>
     </w:p>
@@ -5897,6 +6104,7 @@
         <w:rPr>
           <w:noProof/>
         </w:rPr>
+        <w:lastRenderedPageBreak/>
         <w:drawing>
           <wp:inline distT="0" distB="0" distL="0" distR="0" wp14:anchorId="75041D51" wp14:editId="39E5A609">
             <wp:extent cx="5715000" cy="2314575"/>
@@ -5953,11 +6161,7 @@
         <w:jc w:val="both"/>
       </w:pPr>
       <w:r>
-        <w:t xml:space="preserve">Bảng 4 tổng hợp các chỉ số frame-level tái tính từ CSV. Bài Codman có ACC không tính UNKNOWN 71,2% so với 38,7% của bài tập với gậy; nếu tính cả </w:t>
-      </w:r>
-      <w:r>
-        <w:lastRenderedPageBreak/>
-        <w:t>UNKNOWN, bài gậy giảm còn 33,9%. Sai số góc trung bình của Codman là MAE 13,3° và RMSE 19,2°, thấp hơn bài gậy (MAE 16,8°, RMSE 22,6°).</w:t>
+        <w:t>Bảng 4 tổng hợp các chỉ số frame-level tái tính từ CSV. Bài Codman có ACC không tính UNKNOWN 71,2% so với 38,7% của bài tập với gậy; nếu tính cả UNKNOWN, bài gậy giảm còn 33,9%. Sai số góc trung bình của Codman là MAE 13,3° và RMSE 19,2°, thấp hơn bài gậy (MAE 16,8°, RMSE 22,6°).</w:t>
       </w:r>
     </w:p>
     <w:p>
@@ -6587,7 +6791,11 @@
         <w:jc w:val="both"/>
       </w:pPr>
       <w:r>
-        <w:t>Bảng 5 trình bày chi tiết các chỉ số theo từng video và giai đoạn. Xu hướng chung là Codman đạt tốt ở BN02–BN04 trong GĐ1–GĐ2, nhưng BN01 giảm mạnh do nhiều khung NEAR/FAIL và có hiện tượng người hỗ trợ đi vào vùng nhận dạng. Ở GĐ3, ACC của Codman giảm còn 35,5%–68,8% tùy người bệnh. Bài tập với gậy có ACC thấp hơn (31,7%–44,1%) và chịu ảnh hưởng rõ của các khung UNKNOWN, đặc biệt BN04 có 4.098 khung UNKNOWN.</w:t>
+        <w:t xml:space="preserve">Bảng 5 trình bày chi tiết các chỉ số theo từng video và giai đoạn. Xu hướng chung là Codman đạt tốt ở BN02–BN04 trong GĐ1–GĐ2, nhưng BN01 giảm mạnh do nhiều khung NEAR/FAIL và có hiện tượng người hỗ trợ đi vào vùng nhận dạng. Ở GĐ3, ACC của Codman giảm còn 35,5%–68,8% tùy người bệnh. Bài tập với gậy có ACC thấp hơn </w:t>
+      </w:r>
+      <w:r>
+        <w:lastRenderedPageBreak/>
+        <w:t>(31,7%–44,1%) và chịu ảnh hưởng rõ của các khung UNKNOWN, đặc biệt BN04 có 4.098 khung UNKNOWN.</w:t>
       </w:r>
     </w:p>
     <w:p>
@@ -8465,7 +8673,6 @@
                 <w:sz w:val="24"/>
                 <w:szCs w:val="24"/>
               </w:rPr>
-              <w:lastRenderedPageBreak/>
               <w:t>BN02</w:t>
             </w:r>
           </w:p>
@@ -11456,6 +11663,7 @@
                 <w:sz w:val="24"/>
                 <w:szCs w:val="24"/>
               </w:rPr>
+              <w:lastRenderedPageBreak/>
               <w:t>BN04</w:t>
             </w:r>
           </w:p>
@@ -11774,7 +11982,6 @@
         <w:rPr>
           <w:noProof/>
         </w:rPr>
-        <w:lastRenderedPageBreak/>
         <w:drawing>
           <wp:inline distT="0" distB="0" distL="0" distR="0" wp14:anchorId="3A1F799E" wp14:editId="64896DC6">
             <wp:extent cx="5715000" cy="3276600"/>
@@ -11843,6 +12050,7 @@
         <w:rPr>
           <w:noProof/>
         </w:rPr>
+        <w:lastRenderedPageBreak/>
         <w:drawing>
           <wp:inline distT="0" distB="0" distL="0" distR="0" wp14:anchorId="07453ACC" wp14:editId="05ED4CE0">
             <wp:extent cx="5715000" cy="2562225"/>
@@ -11919,7 +12127,6 @@
         <w:jc w:val="both"/>
       </w:pPr>
       <w:r>
-        <w:lastRenderedPageBreak/>
         <w:t>Đối chiếu góc vai trung bình theo 16 lượt đo (Codman tách GĐ1–GĐ3; bài gậy tính một lượt trên tất cả khung hình của toàn video) cho thấy tương quan giữa góc AI và góc tham chiếu trong CSV đạt r = 0.94 (Hình 5a). Biểu đồ Bland–Altman (Hình 5b) cho thấy AI có xu hướng đo cao hơn tham chiếu, với bias +9.4° và giới hạn đồng thuận 95% từ -3.8° đến +22.6°. Hình 6 tóm tắt năm chỉ số frame-level đã chuẩn hóa, cho thấy Codman tốt hơn bài gậy về ACC và PASS+NEAR, trong khi sai số góc của hai bài vẫn còn cao so với kỳ vọng lâm sàng.</w:t>
       </w:r>
     </w:p>
@@ -11990,6 +12197,7 @@
         <w:rPr>
           <w:noProof/>
         </w:rPr>
+        <w:lastRenderedPageBreak/>
         <w:drawing>
           <wp:inline distT="0" distB="0" distL="0" distR="0" wp14:anchorId="413E54AF" wp14:editId="0F439C23">
             <wp:extent cx="3886200" cy="3829050"/>
@@ -12036,7 +12244,6 @@
         <w:jc w:val="center"/>
       </w:pPr>
       <w:r>
-        <w:lastRenderedPageBreak/>
         <w:t>Hình 6. Radar năm chỉ số frame-level từ CSV mới (ACC, PASS+NEAR, tỷ lệ khung biết, MAE* và RMSE*; điểm càng xa tâm càng tốt).</w:t>
       </w:r>
     </w:p>
@@ -12072,7 +12279,11 @@
         <w:jc w:val="both"/>
       </w:pPr>
       <w:r>
-        <w:t>Hiện tượng suy giảm độ chính xác khi siết ngưỡng dung sai xuống ±15° cho thấy giới hạn về độ phân giải góc của ước lượng tư thế không điểm đánh dấu, vốn chịu ảnh hưởng của rung tọa độ điểm khớp, thiếu thông tin chiều sâu khi dùng camera đơn và điều kiện ghi hình. Trường hợp BN01 Codman minh họa thêm một hạn chế thực tế: khi người hỗ trợ đi vào gần vùng người bệnh, bộ lọc đa người chưa luôn loại được nhiễu, dẫn tới một số khung vẫn được nhận dạng và chấm điểm dù ảnh có hai người.</w:t>
+        <w:t xml:space="preserve">Hiện tượng suy giảm độ chính xác khi siết ngưỡng dung sai xuống ±15° cho thấy giới hạn về độ phân giải góc của ước lượng tư thế không điểm đánh dấu, vốn chịu ảnh hưởng của rung tọa độ điểm khớp, thiếu thông tin chiều sâu khi dùng camera đơn và điều kiện ghi hình. Trường hợp BN01 Codman minh họa thêm một hạn chế thực tế: khi </w:t>
+      </w:r>
+      <w:r>
+        <w:lastRenderedPageBreak/>
+        <w:t>người hỗ trợ đi vào gần vùng người bệnh, bộ lọc đa người chưa luôn loại được nhiễu, dẫn tới một số khung vẫn được nhận dạng và chấm điểm dù ảnh có hai người.</w:t>
       </w:r>
     </w:p>
     <w:p>
@@ -12095,14 +12306,7 @@
         <w:rPr>
           <w:color w:val="000000"/>
         </w:rPr>
-        <w:t xml:space="preserve">Ở khía cạnh ứng dụng, nghiên cứu chứng minh tính khả thi của giám sát phục hồi chức năng từ xa bằng thị giác máy tính marker-less trong điều kiện Việt Nam, đặc biệt với động tác đơn giản như con lắc Codman. Hệ thống xây dựng được một hệ sinh thái khép kín gồm bốn vai trò (người bệnh, bác sĩ, kỹ thuật viên và nghiên cứu viên), với các năng lực phân đoạn giai đoạn tự động, phản hồi âm thanh theo thời gian thực và đồng bộ dữ liệu lên đám mây, tạo nền tảng cho việc theo dõi tiến trình hồi phục từ xa. Tuy vậy, nghiên cứu còn một số hạn chế: cỡ mẫu nhỏ và thực hiện tại một cơ sở với </w:t>
-      </w:r>
-      <w:r>
-        <w:rPr>
-          <w:color w:val="000000"/>
-        </w:rPr>
-        <w:lastRenderedPageBreak/>
-        <w:t>toàn bộ là nữ giới nên tính khái quát còn thấp; việc dùng một camera đơn thiếu thông tin chiều sâu; mô hình tiền huấn luyện chưa được tinh chỉnh trên dữ liệu bệnh nhân; bài tập với gậy cần bổ sung tiêu chí nhận diện tư thế bù trừ; và bài tập với dây kháng lực cũng như việc triển khai trên người dùng thực chưa được đánh giá. Các hướng phát triển tiếp theo gồm mở rộng mẫu đa trung tâm, tinh chỉnh mô hình trên chính dữ liệu người bệnh, bổ sung tiêu chí tư thế và thông tin chiều sâu, đồng thời thu thập đánh giá lâm sàng độc lập của chuyên gia để củng cố giá trị tham chiếu.</w:t>
+        <w:t>Ở khía cạnh ứng dụng, nghiên cứu chứng minh tính khả thi của giám sát phục hồi chức năng từ xa bằng thị giác máy tính marker-less trong điều kiện Việt Nam, đặc biệt với động tác đơn giản như con lắc Codman. Hệ thống xây dựng được một hệ sinh thái khép kín gồm bốn vai trò (người bệnh, bác sĩ, kỹ thuật viên và nghiên cứu viên), với các năng lực phân đoạn giai đoạn tự động, phản hồi âm thanh theo thời gian thực và đồng bộ dữ liệu lên đám mây, tạo nền tảng cho việc theo dõi tiến trình hồi phục từ xa. Tuy vậy, nghiên cứu còn một số hạn chế: cỡ mẫu nhỏ và thực hiện tại một cơ sở với toàn bộ là nữ giới nên tính khái quát còn thấp; việc dùng một camera đơn thiếu thông tin chiều sâu; mô hình tiền huấn luyện chưa được tinh chỉnh trên dữ liệu bệnh nhân; bài tập với gậy cần bổ sung tiêu chí nhận diện tư thế bù trừ; và bài tập với dây kháng lực cũng như việc triển khai trên người dùng thực chưa được đánh giá. Các hướng phát triển tiếp theo gồm mở rộng mẫu đa trung tâm, tinh chỉnh mô hình trên chính dữ liệu người bệnh, bổ sung tiêu chí tư thế và thông tin chiều sâu, đồng thời thu thập đánh giá lâm sàng độc lập của chuyên gia để củng cố giá trị tham chiếu.</w:t>
       </w:r>
     </w:p>
     <w:p>
@@ -12136,6 +12340,7 @@
           <w:b/>
           <w:bCs/>
         </w:rPr>
+        <w:lastRenderedPageBreak/>
         <w:t>TÀI LIỆU THAM KHẢO</w:t>
       </w:r>
     </w:p>
@@ -12196,7 +12401,6 @@
         <w:jc w:val="both"/>
       </w:pPr>
       <w:r>
-        <w:lastRenderedPageBreak/>
         <w:t>6. Sardari S, Sharifzadeh S, Daneshkhah A, Nakisa B, Loke SW, Palade V, et al. Artificial intelligence for skeleton-based physical rehabilitation action evaluation: a systematic review. Comput Biol Med. 2023;158:106835.</w:t>
       </w:r>
     </w:p>
@@ -12267,6 +12471,7 @@
         <w:jc w:val="both"/>
       </w:pPr>
       <w:r>
+        <w:lastRenderedPageBreak/>
         <w:t>13. Ino T, Samukawa M, Ishida T, Wada N, Koshino Y, Kasahara S, et al. Validity and reliability of OpenPose-based motion analysis in measuring knee valgus during drop vertical jump test. J Sports Sci Med. 2024;23(3):515-525.</w:t>
       </w:r>
     </w:p>

</xml_diff>